<commit_message>
SRS 3.1 and CMED guide: consent travels in API 2
API 2 now carries consent_obtained, consent_method and (optionally)
consent_recorded_at, taken from CMED's reception records. This closes
OD-13, left open when the trigger stopped carrying consent.

Without consent nothing is kept: the recording stops, audio already
captured is deleted without upload, no patient information or
prescription is stored for that visit, and both Channel B calls are
answered 200 CONSENT_NOT_GIVEN, so there is nothing to retry.

SRS: SRS-CNF-11..12 and SRS-UIX-14 added; SRS-BKD-01, SRS-GRT-03 and
SRS-GRT-08 updated; failure 23 and AT-77 added; AT-03 rewritten.
Guide: consent fields and rule in API 2, a Channel B reply table,
and the confirmation table updated.
</commit_message>
<xml_diff>
--- a/cmed/CMED_Integration_Guide.docx
+++ b/cmed/CMED_Integration_Guide.docx
@@ -20,7 +20,7 @@
     </w:p>
     <w:p>
       <w:r>
-        <w:t>AIMS LAB · Independent University, Bangladesh · 12 September 2026</w:t>
+        <w:t>AIMS LAB · Independent University, Bangladesh · 14 September 2026</w:t>
       </w:r>
     </w:p>
     <w:p>
@@ -209,7 +209,7 @@
               <w:rPr>
                 <w:sz w:val="18"/>
               </w:rPr>
-              <w:t>Patient information</w:t>
+              <w:t>Patient information, including consent</w:t>
             </w:r>
           </w:p>
         </w:tc>
@@ -1044,7 +1044,7 @@
     </w:p>
     <w:p>
       <w:r>
-        <w:t>Before the patient enters the doctor's room, a paramedic records their details and takes basic measurements. The doctor needs those at the start of the consultation, and so do we. If the patient has been to this hospital before, we also need their most recent prescription — the doctor refers to it, and our system needs it to make sense of what is said.</w:t>
+        <w:t>Before the patient enters the doctor's room, reception asks for the patient's consent, and a paramedic records their details and takes basic measurements. The doctor needs those at the start of the consultation, and so do we. If the patient has been to this hospital before, we also need their most recent prescription — the doctor refers to it, and our system needs it to make sense of what is said.</w:t>
       </w:r>
     </w:p>
     <w:p>
@@ -1082,6 +1082,12 @@
         <w:br/>
         <w:t xml:space="preserve">  "date":        "2026-09-10",</w:t>
         <w:br/>
+        <w:t xml:space="preserve">  "consent_obtained":    true,</w:t>
+        <w:br/>
+        <w:t xml:space="preserve">  "consent_method":      "verbal_at_reception",</w:t>
+        <w:br/>
+        <w:t xml:space="preserve">  "consent_recorded_at": "2026-09-10T10:02:00+06:00",</w:t>
+        <w:br/>
         <w:t xml:space="preserve">  "demographics": {</w:t>
         <w:br/>
         <w:t xml:space="preserve">    "name": "…", "sex": "female", "age_years": 34,</w:t>
@@ -1117,6 +1123,301 @@
         <w:t xml:space="preserve">  }</w:t>
         <w:br/>
         <w:t>}</w:t>
+      </w:r>
+    </w:p>
+    <w:p>
+      <w:r>
+        <w:rPr>
+          <w:b/>
+        </w:rPr>
+        <w:t>Consent.</w:t>
+      </w:r>
+      <w:r>
+        <w:t xml:space="preserve"> Send the consent your reception recorded for this visit.</w:t>
+      </w:r>
+    </w:p>
+    <w:tbl>
+      <w:tblPr>
+        <w:tblStyle w:val="TableGrid"/>
+        <w:tblW w:type="auto" w:w="0"/>
+        <w:tblLook w:firstColumn="1" w:firstRow="1" w:lastColumn="0" w:lastRow="0" w:noHBand="0" w:noVBand="1" w:val="04A0"/>
+      </w:tblPr>
+      <w:tblGrid>
+        <w:gridCol w:w="2880"/>
+        <w:gridCol w:w="2880"/>
+        <w:gridCol w:w="2880"/>
+      </w:tblGrid>
+      <w:tr>
+        <w:tc>
+          <w:tcPr>
+            <w:tcW w:type="dxa" w:w="2880"/>
+          </w:tcPr>
+          <w:p>
+            <w:r>
+              <w:rPr>
+                <w:b/>
+              </w:rPr>
+            </w:r>
+            <w:r>
+              <w:rPr>
+                <w:b/>
+                <w:sz w:val="18"/>
+              </w:rPr>
+              <w:t>Field</w:t>
+            </w:r>
+          </w:p>
+        </w:tc>
+        <w:tc>
+          <w:tcPr>
+            <w:tcW w:type="dxa" w:w="2880"/>
+          </w:tcPr>
+          <w:p>
+            <w:r>
+              <w:rPr>
+                <w:b/>
+              </w:rPr>
+            </w:r>
+            <w:r>
+              <w:rPr>
+                <w:b/>
+                <w:sz w:val="18"/>
+              </w:rPr>
+              <w:t>Required</w:t>
+            </w:r>
+          </w:p>
+        </w:tc>
+        <w:tc>
+          <w:tcPr>
+            <w:tcW w:type="dxa" w:w="2880"/>
+          </w:tcPr>
+          <w:p>
+            <w:r>
+              <w:rPr>
+                <w:b/>
+              </w:rPr>
+            </w:r>
+            <w:r>
+              <w:rPr>
+                <w:b/>
+                <w:sz w:val="18"/>
+              </w:rPr>
+              <w:t>Rule</w:t>
+            </w:r>
+          </w:p>
+        </w:tc>
+      </w:tr>
+      <w:tr>
+        <w:tc>
+          <w:tcPr>
+            <w:tcW w:type="dxa" w:w="2880"/>
+          </w:tcPr>
+          <w:p>
+            <w:r/>
+            <w:r>
+              <w:rPr>
+                <w:rFonts w:ascii="Consolas" w:hAnsi="Consolas"/>
+                <w:sz w:val="18"/>
+              </w:rPr>
+              <w:t>consent_obtained</w:t>
+            </w:r>
+          </w:p>
+        </w:tc>
+        <w:tc>
+          <w:tcPr>
+            <w:tcW w:type="dxa" w:w="2880"/>
+          </w:tcPr>
+          <w:p>
+            <w:r/>
+            <w:r>
+              <w:rPr>
+                <w:sz w:val="18"/>
+              </w:rPr>
+              <w:t>Yes</w:t>
+            </w:r>
+          </w:p>
+        </w:tc>
+        <w:tc>
+          <w:tcPr>
+            <w:tcW w:type="dxa" w:w="2880"/>
+          </w:tcPr>
+          <w:p>
+            <w:r/>
+            <w:r>
+              <w:rPr>
+                <w:rFonts w:ascii="Consolas" w:hAnsi="Consolas"/>
+                <w:sz w:val="18"/>
+              </w:rPr>
+              <w:t>true</w:t>
+            </w:r>
+            <w:r>
+              <w:rPr>
+                <w:sz w:val="18"/>
+              </w:rPr>
+              <w:t xml:space="preserve"> only if the patient agreed to be recorded and to their record being used.</w:t>
+            </w:r>
+          </w:p>
+        </w:tc>
+      </w:tr>
+      <w:tr>
+        <w:tc>
+          <w:tcPr>
+            <w:tcW w:type="dxa" w:w="2880"/>
+          </w:tcPr>
+          <w:p>
+            <w:r/>
+            <w:r>
+              <w:rPr>
+                <w:rFonts w:ascii="Consolas" w:hAnsi="Consolas"/>
+                <w:sz w:val="18"/>
+              </w:rPr>
+              <w:t>consent_method</w:t>
+            </w:r>
+          </w:p>
+        </w:tc>
+        <w:tc>
+          <w:tcPr>
+            <w:tcW w:type="dxa" w:w="2880"/>
+          </w:tcPr>
+          <w:p>
+            <w:r/>
+            <w:r>
+              <w:rPr>
+                <w:sz w:val="18"/>
+              </w:rPr>
+              <w:t>Yes</w:t>
+            </w:r>
+          </w:p>
+        </w:tc>
+        <w:tc>
+          <w:tcPr>
+            <w:tcW w:type="dxa" w:w="2880"/>
+          </w:tcPr>
+          <w:p>
+            <w:r/>
+            <w:r>
+              <w:rPr>
+                <w:sz w:val="18"/>
+              </w:rPr>
+              <w:t xml:space="preserve">How consent was taken, up to 64 characters — for example </w:t>
+            </w:r>
+            <w:r>
+              <w:rPr>
+                <w:rFonts w:ascii="Consolas" w:hAnsi="Consolas"/>
+                <w:sz w:val="18"/>
+              </w:rPr>
+              <w:t>verbal_at_reception</w:t>
+            </w:r>
+            <w:r>
+              <w:rPr>
+                <w:sz w:val="18"/>
+              </w:rPr>
+              <w:t xml:space="preserve"> or </w:t>
+            </w:r>
+            <w:r>
+              <w:rPr>
+                <w:rFonts w:ascii="Consolas" w:hAnsi="Consolas"/>
+                <w:sz w:val="18"/>
+              </w:rPr>
+              <w:t>signed_form</w:t>
+            </w:r>
+            <w:r>
+              <w:rPr>
+                <w:sz w:val="18"/>
+              </w:rPr>
+              <w:t>.</w:t>
+            </w:r>
+          </w:p>
+        </w:tc>
+      </w:tr>
+      <w:tr>
+        <w:tc>
+          <w:tcPr>
+            <w:tcW w:type="dxa" w:w="2880"/>
+          </w:tcPr>
+          <w:p>
+            <w:r/>
+            <w:r>
+              <w:rPr>
+                <w:rFonts w:ascii="Consolas" w:hAnsi="Consolas"/>
+                <w:sz w:val="18"/>
+              </w:rPr>
+              <w:t>consent_recorded_at</w:t>
+            </w:r>
+          </w:p>
+        </w:tc>
+        <w:tc>
+          <w:tcPr>
+            <w:tcW w:type="dxa" w:w="2880"/>
+          </w:tcPr>
+          <w:p>
+            <w:r/>
+            <w:r>
+              <w:rPr>
+                <w:sz w:val="18"/>
+              </w:rPr>
+              <w:t>Helpful</w:t>
+            </w:r>
+          </w:p>
+        </w:tc>
+        <w:tc>
+          <w:tcPr>
+            <w:tcW w:type="dxa" w:w="2880"/>
+          </w:tcPr>
+          <w:p>
+            <w:r/>
+            <w:r>
+              <w:rPr>
+                <w:sz w:val="18"/>
+              </w:rPr>
+              <w:t>When reception recorded it, with the time zone.</w:t>
+            </w:r>
+          </w:p>
+        </w:tc>
+      </w:tr>
+    </w:tbl>
+    <w:p/>
+    <w:p>
+      <w:r>
+        <w:t xml:space="preserve">If </w:t>
+      </w:r>
+      <w:r>
+        <w:rPr>
+          <w:rFonts w:ascii="Consolas" w:hAnsi="Consolas"/>
+          <w:sz w:val="20"/>
+        </w:rPr>
+        <w:t>consent_obtained</w:t>
+      </w:r>
+      <w:r>
+        <w:t xml:space="preserve"> is </w:t>
+      </w:r>
+      <w:r>
+        <w:rPr>
+          <w:rFonts w:ascii="Consolas" w:hAnsi="Consolas"/>
+          <w:sz w:val="20"/>
+        </w:rPr>
+        <w:t>false</w:t>
+      </w:r>
+      <w:r>
+        <w:t xml:space="preserve">, or missing, </w:t>
+      </w:r>
+      <w:r>
+        <w:rPr>
+          <w:b/>
+        </w:rPr>
+        <w:t>we keep nothing for that visit.</w:t>
+      </w:r>
+      <w:r>
+        <w:t xml:space="preserve"> The recorder stops, the audio it had already captured is deleted without being uploaded, and we store none of the patient's information or the prescription. The doctor's on-screen control says the consultation is not being recorded; the doctor carries on as normal. Our server replies </w:t>
+      </w:r>
+      <w:r>
+        <w:rPr>
+          <w:rFonts w:ascii="Consolas" w:hAnsi="Consolas"/>
+          <w:sz w:val="20"/>
+        </w:rPr>
+        <w:t>200 CONSENT_NOT_GIVEN</w:t>
+      </w:r>
+      <w:r>
+        <w:t>. There is nothing to retry.</w:t>
       </w:r>
     </w:p>
     <w:p>
@@ -1327,7 +1628,17 @@
         <w:t>start_time</w:t>
       </w:r>
       <w:r>
-        <w:t xml:space="preserve"> — not the time the prescription was issued. That is how the prescription attaches to the right consultation.</w:t>
+        <w:t xml:space="preserve"> — not the time the prescription was issued. That is how the prescription attaches to the right consultation. If API 2 said the patient did not consent, we reply </w:t>
+      </w:r>
+      <w:r>
+        <w:rPr>
+          <w:rFonts w:ascii="Consolas" w:hAnsi="Consolas"/>
+          <w:sz w:val="20"/>
+        </w:rPr>
+        <w:t>200 CONSENT_NOT_GIVEN</w:t>
+      </w:r>
+      <w:r>
+        <w:t xml:space="preserve"> and keep nothing.</w:t>
       </w:r>
     </w:p>
     <w:p>
@@ -2314,6 +2625,461 @@
         <w:rPr>
           <w:b/>
         </w:rPr>
+        <w:t>Replies from our server to API 2 and the prescription (Channel B).</w:t>
+      </w:r>
+    </w:p>
+    <w:tbl>
+      <w:tblPr>
+        <w:tblStyle w:val="TableGrid"/>
+        <w:tblW w:type="auto" w:w="0"/>
+        <w:tblLook w:firstColumn="1" w:firstRow="1" w:lastColumn="0" w:lastRow="0" w:noHBand="0" w:noVBand="1" w:val="04A0"/>
+      </w:tblPr>
+      <w:tblGrid>
+        <w:gridCol w:w="2160"/>
+        <w:gridCol w:w="2160"/>
+        <w:gridCol w:w="2160"/>
+        <w:gridCol w:w="2160"/>
+      </w:tblGrid>
+      <w:tr>
+        <w:tc>
+          <w:tcPr>
+            <w:tcW w:type="dxa" w:w="2160"/>
+          </w:tcPr>
+          <w:p>
+            <w:r>
+              <w:rPr>
+                <w:b/>
+              </w:rPr>
+            </w:r>
+            <w:r>
+              <w:rPr>
+                <w:rFonts w:ascii="Consolas" w:hAnsi="Consolas"/>
+                <w:b/>
+                <w:sz w:val="18"/>
+              </w:rPr>
+              <w:t>status</w:t>
+            </w:r>
+          </w:p>
+        </w:tc>
+        <w:tc>
+          <w:tcPr>
+            <w:tcW w:type="dxa" w:w="2160"/>
+          </w:tcPr>
+          <w:p>
+            <w:r>
+              <w:rPr>
+                <w:b/>
+              </w:rPr>
+            </w:r>
+            <w:r>
+              <w:rPr>
+                <w:rFonts w:ascii="Consolas" w:hAnsi="Consolas"/>
+                <w:b/>
+                <w:sz w:val="18"/>
+              </w:rPr>
+              <w:t>code</w:t>
+            </w:r>
+          </w:p>
+        </w:tc>
+        <w:tc>
+          <w:tcPr>
+            <w:tcW w:type="dxa" w:w="2160"/>
+          </w:tcPr>
+          <w:p>
+            <w:r>
+              <w:rPr>
+                <w:b/>
+              </w:rPr>
+            </w:r>
+            <w:r>
+              <w:rPr>
+                <w:b/>
+                <w:sz w:val="18"/>
+              </w:rPr>
+              <w:t>Meaning</w:t>
+            </w:r>
+          </w:p>
+        </w:tc>
+        <w:tc>
+          <w:tcPr>
+            <w:tcW w:type="dxa" w:w="2160"/>
+          </w:tcPr>
+          <w:p>
+            <w:r>
+              <w:rPr>
+                <w:b/>
+              </w:rPr>
+            </w:r>
+            <w:r>
+              <w:rPr>
+                <w:b/>
+                <w:sz w:val="18"/>
+              </w:rPr>
+              <w:t>What CMED's server should do</w:t>
+            </w:r>
+          </w:p>
+        </w:tc>
+      </w:tr>
+      <w:tr>
+        <w:tc>
+          <w:tcPr>
+            <w:tcW w:type="dxa" w:w="2160"/>
+          </w:tcPr>
+          <w:p>
+            <w:r/>
+            <w:r>
+              <w:rPr>
+                <w:sz w:val="18"/>
+              </w:rPr>
+              <w:t>202</w:t>
+            </w:r>
+          </w:p>
+        </w:tc>
+        <w:tc>
+          <w:tcPr>
+            <w:tcW w:type="dxa" w:w="2160"/>
+          </w:tcPr>
+          <w:p>
+            <w:r/>
+            <w:r>
+              <w:rPr>
+                <w:rFonts w:ascii="Consolas" w:hAnsi="Consolas"/>
+                <w:sz w:val="18"/>
+              </w:rPr>
+              <w:t>ACCEPTED</w:t>
+            </w:r>
+          </w:p>
+        </w:tc>
+        <w:tc>
+          <w:tcPr>
+            <w:tcW w:type="dxa" w:w="2160"/>
+          </w:tcPr>
+          <w:p>
+            <w:r/>
+            <w:r>
+              <w:rPr>
+                <w:sz w:val="18"/>
+              </w:rPr>
+              <w:t>Stored</w:t>
+            </w:r>
+          </w:p>
+        </w:tc>
+        <w:tc>
+          <w:tcPr>
+            <w:tcW w:type="dxa" w:w="2160"/>
+          </w:tcPr>
+          <w:p>
+            <w:r/>
+            <w:r>
+              <w:rPr>
+                <w:sz w:val="18"/>
+              </w:rPr>
+              <w:t>Nothing</w:t>
+            </w:r>
+          </w:p>
+        </w:tc>
+      </w:tr>
+      <w:tr>
+        <w:tc>
+          <w:tcPr>
+            <w:tcW w:type="dxa" w:w="2160"/>
+          </w:tcPr>
+          <w:p>
+            <w:r/>
+            <w:r>
+              <w:rPr>
+                <w:sz w:val="18"/>
+              </w:rPr>
+              <w:t>200</w:t>
+            </w:r>
+          </w:p>
+        </w:tc>
+        <w:tc>
+          <w:tcPr>
+            <w:tcW w:type="dxa" w:w="2160"/>
+          </w:tcPr>
+          <w:p>
+            <w:r/>
+            <w:r>
+              <w:rPr>
+                <w:rFonts w:ascii="Consolas" w:hAnsi="Consolas"/>
+                <w:sz w:val="18"/>
+              </w:rPr>
+              <w:t>ALREADY_RECEIVED</w:t>
+            </w:r>
+          </w:p>
+        </w:tc>
+        <w:tc>
+          <w:tcPr>
+            <w:tcW w:type="dxa" w:w="2160"/>
+          </w:tcPr>
+          <w:p>
+            <w:r/>
+            <w:r>
+              <w:rPr>
+                <w:sz w:val="18"/>
+              </w:rPr>
+              <w:t>This exact request was already stored</w:t>
+            </w:r>
+          </w:p>
+        </w:tc>
+        <w:tc>
+          <w:tcPr>
+            <w:tcW w:type="dxa" w:w="2160"/>
+          </w:tcPr>
+          <w:p>
+            <w:r/>
+            <w:r>
+              <w:rPr>
+                <w:sz w:val="18"/>
+              </w:rPr>
+              <w:t>Nothing</w:t>
+            </w:r>
+          </w:p>
+        </w:tc>
+      </w:tr>
+      <w:tr>
+        <w:tc>
+          <w:tcPr>
+            <w:tcW w:type="dxa" w:w="2160"/>
+          </w:tcPr>
+          <w:p>
+            <w:r/>
+            <w:r>
+              <w:rPr>
+                <w:sz w:val="18"/>
+              </w:rPr>
+              <w:t>200</w:t>
+            </w:r>
+          </w:p>
+        </w:tc>
+        <w:tc>
+          <w:tcPr>
+            <w:tcW w:type="dxa" w:w="2160"/>
+          </w:tcPr>
+          <w:p>
+            <w:r/>
+            <w:r>
+              <w:rPr>
+                <w:rFonts w:ascii="Consolas" w:hAnsi="Consolas"/>
+                <w:sz w:val="18"/>
+              </w:rPr>
+              <w:t>CONSENT_NOT_GIVEN</w:t>
+            </w:r>
+          </w:p>
+        </w:tc>
+        <w:tc>
+          <w:tcPr>
+            <w:tcW w:type="dxa" w:w="2160"/>
+          </w:tcPr>
+          <w:p>
+            <w:r/>
+            <w:r>
+              <w:rPr>
+                <w:sz w:val="18"/>
+              </w:rPr>
+              <w:t>No consent: nothing kept for this visit</w:t>
+            </w:r>
+          </w:p>
+        </w:tc>
+        <w:tc>
+          <w:tcPr>
+            <w:tcW w:type="dxa" w:w="2160"/>
+          </w:tcPr>
+          <w:p>
+            <w:r/>
+            <w:r>
+              <w:rPr>
+                <w:sz w:val="18"/>
+              </w:rPr>
+              <w:t>Nothing. Do not retry.</w:t>
+            </w:r>
+          </w:p>
+        </w:tc>
+      </w:tr>
+      <w:tr>
+        <w:tc>
+          <w:tcPr>
+            <w:tcW w:type="dxa" w:w="2160"/>
+          </w:tcPr>
+          <w:p>
+            <w:r/>
+            <w:r>
+              <w:rPr>
+                <w:sz w:val="18"/>
+              </w:rPr>
+              <w:t>400 · 401 · 413 · 422</w:t>
+            </w:r>
+          </w:p>
+        </w:tc>
+        <w:tc>
+          <w:tcPr>
+            <w:tcW w:type="dxa" w:w="2160"/>
+          </w:tcPr>
+          <w:p>
+            <w:r/>
+            <w:r>
+              <w:rPr>
+                <w:sz w:val="18"/>
+              </w:rPr>
+              <w:t xml:space="preserve">e.g. </w:t>
+            </w:r>
+            <w:r>
+              <w:rPr>
+                <w:rFonts w:ascii="Consolas" w:hAnsi="Consolas"/>
+                <w:sz w:val="18"/>
+              </w:rPr>
+              <w:t>MISSING_FIELD</w:t>
+            </w:r>
+            <w:r>
+              <w:rPr>
+                <w:sz w:val="18"/>
+              </w:rPr>
+              <w:t xml:space="preserve">, </w:t>
+            </w:r>
+            <w:r>
+              <w:rPr>
+                <w:rFonts w:ascii="Consolas" w:hAnsi="Consolas"/>
+                <w:sz w:val="18"/>
+              </w:rPr>
+              <w:t>INVALID_KEY</w:t>
+            </w:r>
+            <w:r>
+              <w:rPr>
+                <w:sz w:val="18"/>
+              </w:rPr>
+              <w:t xml:space="preserve">, </w:t>
+            </w:r>
+            <w:r>
+              <w:rPr>
+                <w:rFonts w:ascii="Consolas" w:hAnsi="Consolas"/>
+                <w:sz w:val="18"/>
+              </w:rPr>
+              <w:t>SCHEMA_INVALID</w:t>
+            </w:r>
+          </w:p>
+        </w:tc>
+        <w:tc>
+          <w:tcPr>
+            <w:tcW w:type="dxa" w:w="2160"/>
+          </w:tcPr>
+          <w:p>
+            <w:r/>
+            <w:r>
+              <w:rPr>
+                <w:sz w:val="18"/>
+              </w:rPr>
+              <w:t>The request is wrong</w:t>
+            </w:r>
+          </w:p>
+        </w:tc>
+        <w:tc>
+          <w:tcPr>
+            <w:tcW w:type="dxa" w:w="2160"/>
+          </w:tcPr>
+          <w:p>
+            <w:r/>
+            <w:r>
+              <w:rPr>
+                <w:sz w:val="18"/>
+              </w:rPr>
+              <w:t>Log it for a developer; do not retry unchanged</w:t>
+            </w:r>
+          </w:p>
+        </w:tc>
+      </w:tr>
+      <w:tr>
+        <w:tc>
+          <w:tcPr>
+            <w:tcW w:type="dxa" w:w="2160"/>
+          </w:tcPr>
+          <w:p>
+            <w:r/>
+            <w:r>
+              <w:rPr>
+                <w:sz w:val="18"/>
+              </w:rPr>
+              <w:t>429 · 500 · 503</w:t>
+            </w:r>
+          </w:p>
+        </w:tc>
+        <w:tc>
+          <w:tcPr>
+            <w:tcW w:type="dxa" w:w="2160"/>
+          </w:tcPr>
+          <w:p>
+            <w:r/>
+            <w:r>
+              <w:rPr>
+                <w:rFonts w:ascii="Consolas" w:hAnsi="Consolas"/>
+                <w:sz w:val="18"/>
+              </w:rPr>
+              <w:t>RATE_LIMITED</w:t>
+            </w:r>
+            <w:r>
+              <w:rPr>
+                <w:sz w:val="18"/>
+              </w:rPr>
+              <w:t xml:space="preserve">, </w:t>
+            </w:r>
+            <w:r>
+              <w:rPr>
+                <w:rFonts w:ascii="Consolas" w:hAnsi="Consolas"/>
+                <w:sz w:val="18"/>
+              </w:rPr>
+              <w:t>SERVER_ERROR</w:t>
+            </w:r>
+            <w:r>
+              <w:rPr>
+                <w:sz w:val="18"/>
+              </w:rPr>
+              <w:t xml:space="preserve">, </w:t>
+            </w:r>
+            <w:r>
+              <w:rPr>
+                <w:rFonts w:ascii="Consolas" w:hAnsi="Consolas"/>
+                <w:sz w:val="18"/>
+              </w:rPr>
+              <w:t>UNAVAILABLE</w:t>
+            </w:r>
+          </w:p>
+        </w:tc>
+        <w:tc>
+          <w:tcPr>
+            <w:tcW w:type="dxa" w:w="2160"/>
+          </w:tcPr>
+          <w:p>
+            <w:r/>
+            <w:r>
+              <w:rPr>
+                <w:sz w:val="18"/>
+              </w:rPr>
+              <w:t>Busy or failing on our side</w:t>
+            </w:r>
+          </w:p>
+        </w:tc>
+        <w:tc>
+          <w:tcPr>
+            <w:tcW w:type="dxa" w:w="2160"/>
+          </w:tcPr>
+          <w:p>
+            <w:r/>
+            <w:r>
+              <w:rPr>
+                <w:sz w:val="18"/>
+              </w:rPr>
+              <w:t>Retry in the background, with a growing delay, for up to 24 hours</w:t>
+            </w:r>
+          </w:p>
+        </w:tc>
+      </w:tr>
+    </w:tbl>
+    <w:p/>
+    <w:p>
+      <w:r>
+        <w:rPr>
+          <w:b/>
+        </w:rPr>
         <w:t>The rule that matters more than any of the above:</w:t>
       </w:r>
       <w:r>
@@ -2418,7 +3184,7 @@
         <w:t>A registered PC still cannot record just because someone asks it to.</w:t>
       </w:r>
       <w:r>
-        <w:t xml:space="preserve"> Every consultation needs its own short-lived permission, which the recorder requests from our backend at the moment of the trigger. Our backend checks that the doctor exists and works at that clinic, that the clinic matches the machine's registration, and that consent is recorded. The permission it issues lasts sixty seconds and works once.</w:t>
+        <w:t xml:space="preserve"> Every consultation needs its own short-lived permission, which the recorder requests from our backend at the moment of the trigger. Our backend checks that the doctor exists and works at that clinic, that the clinic matches the machine's registration, and that your API 2 records the patient's consent. The permission it issues lasts sixty seconds and works once.</w:t>
       </w:r>
     </w:p>
     <w:p>
@@ -2606,6 +3372,36 @@
                 <w:sz w:val="18"/>
               </w:rPr>
               <w:t>Confirmed. Nobody notices anything.</w:t>
+            </w:r>
+          </w:p>
+        </w:tc>
+      </w:tr>
+      <w:tr>
+        <w:tc>
+          <w:tcPr>
+            <w:tcW w:type="dxa" w:w="4320"/>
+          </w:tcPr>
+          <w:p>
+            <w:r/>
+            <w:r>
+              <w:rPr>
+                <w:sz w:val="18"/>
+              </w:rPr>
+              <w:t>API 2 says the patient did not consent</w:t>
+            </w:r>
+          </w:p>
+        </w:tc>
+        <w:tc>
+          <w:tcPr>
+            <w:tcW w:type="dxa" w:w="4320"/>
+          </w:tcPr>
+          <w:p>
+            <w:r/>
+            <w:r>
+              <w:rPr>
+                <w:sz w:val="18"/>
+              </w:rPr>
+              <w:t>Recording stops at once. Nothing already captured is uploaded, and nothing about the visit is kept.</w:t>
             </w:r>
           </w:p>
         </w:tc>
@@ -3274,7 +4070,7 @@
               <w:rPr>
                 <w:sz w:val="18"/>
               </w:rPr>
-              <w:t>, and the prescription when it is built, both with the same five fields as API 1</w:t>
+              <w:t>, with the consent from reception, and the prescription when it is built, both with the same five fields as API 1</w:t>
             </w:r>
           </w:p>
         </w:tc>

</xml_diff>

<commit_message>
SRS 3.2 and CMED guide: CMED sends nothing about consent
Reverses the consent fields added to API 2 in 3.1, which would have
added work to CMED's system.

Reception asks each patient for consent, as today. If a patient refuses,
before or during the consultation, the doctor presses Stop and chooses
"Patient did not consent". The microphone cuts at once, the recording
is deleted from the PC, R2 and the UIU server, and nothing is kept for
that visit except an audit entry with no audio and no patient ID.
CMED keeps sending API 1-3 unchanged.

SRS: new section 7.8a (SRS-CNS-01..10); SRS-CNF-11..12 and SRS-UIX-14
withdrawn; SRS-BKD-01 and SRS-REC-10 rewritten; OD-13 closed; OD-22
asks the ethics committee to accept this; AT-03, AT-77 rewritten,
AT-78 added.
Guide: consent fields removed; new section 9b explains the refusal path.
</commit_message>
<xml_diff>
--- a/cmed/CMED_Integration_Guide.docx
+++ b/cmed/CMED_Integration_Guide.docx
@@ -209,7 +209,7 @@
               <w:rPr>
                 <w:sz w:val="18"/>
               </w:rPr>
-              <w:t>Patient information, including consent</w:t>
+              <w:t>Patient information</w:t>
             </w:r>
           </w:p>
         </w:tc>
@@ -317,7 +317,7 @@
         <w:t>What CMED does not have to do.</w:t>
       </w:r>
       <w:r>
-        <w:t xml:space="preserve"> No audio to capture, store or handle. No cryptographic keys to hold or rotate. No changes to the CMED database. No new login system. No software to install on the doctor's PC. No screen to build — every message the doctor sees comes from our own small on-screen control, not from CMED.</w:t>
+        <w:t xml:space="preserve"> Nothing about patient consent (§9b). No audio to capture, store or handle. No cryptographic keys to hold or rotate. No changes to the CMED database. No new login system. No software to install on the doctor's PC. No screen to build — every message the doctor sees comes from our own small on-screen control, not from CMED.</w:t>
       </w:r>
     </w:p>
     <w:p>
@@ -1044,7 +1044,7 @@
     </w:p>
     <w:p>
       <w:r>
-        <w:t>Before the patient enters the doctor's room, reception asks for the patient's consent, and a paramedic records their details and takes basic measurements. The doctor needs those at the start of the consultation, and so do we. If the patient has been to this hospital before, we also need their most recent prescription — the doctor refers to it, and our system needs it to make sense of what is said.</w:t>
+        <w:t>Before the patient enters the doctor's room, a paramedic records their details and takes basic measurements. The doctor needs those at the start of the consultation, and so do we. If the patient has been to this hospital before, we also need their most recent prescription — the doctor refers to it, and our system needs it to make sense of what is said.</w:t>
       </w:r>
     </w:p>
     <w:p>
@@ -1082,12 +1082,6 @@
         <w:br/>
         <w:t xml:space="preserve">  "date":        "2026-09-10",</w:t>
         <w:br/>
-        <w:t xml:space="preserve">  "consent_obtained":    true,</w:t>
-        <w:br/>
-        <w:t xml:space="preserve">  "consent_method":      "verbal_at_reception",</w:t>
-        <w:br/>
-        <w:t xml:space="preserve">  "consent_recorded_at": "2026-09-10T10:02:00+06:00",</w:t>
-        <w:br/>
         <w:t xml:space="preserve">  "demographics": {</w:t>
         <w:br/>
         <w:t xml:space="preserve">    "name": "…", "sex": "female", "age_years": 34,</w:t>
@@ -1123,301 +1117,6 @@
         <w:t xml:space="preserve">  }</w:t>
         <w:br/>
         <w:t>}</w:t>
-      </w:r>
-    </w:p>
-    <w:p>
-      <w:r>
-        <w:rPr>
-          <w:b/>
-        </w:rPr>
-        <w:t>Consent.</w:t>
-      </w:r>
-      <w:r>
-        <w:t xml:space="preserve"> Send the consent your reception recorded for this visit.</w:t>
-      </w:r>
-    </w:p>
-    <w:tbl>
-      <w:tblPr>
-        <w:tblStyle w:val="TableGrid"/>
-        <w:tblW w:type="auto" w:w="0"/>
-        <w:tblLook w:firstColumn="1" w:firstRow="1" w:lastColumn="0" w:lastRow="0" w:noHBand="0" w:noVBand="1" w:val="04A0"/>
-      </w:tblPr>
-      <w:tblGrid>
-        <w:gridCol w:w="2880"/>
-        <w:gridCol w:w="2880"/>
-        <w:gridCol w:w="2880"/>
-      </w:tblGrid>
-      <w:tr>
-        <w:tc>
-          <w:tcPr>
-            <w:tcW w:type="dxa" w:w="2880"/>
-          </w:tcPr>
-          <w:p>
-            <w:r>
-              <w:rPr>
-                <w:b/>
-              </w:rPr>
-            </w:r>
-            <w:r>
-              <w:rPr>
-                <w:b/>
-                <w:sz w:val="18"/>
-              </w:rPr>
-              <w:t>Field</w:t>
-            </w:r>
-          </w:p>
-        </w:tc>
-        <w:tc>
-          <w:tcPr>
-            <w:tcW w:type="dxa" w:w="2880"/>
-          </w:tcPr>
-          <w:p>
-            <w:r>
-              <w:rPr>
-                <w:b/>
-              </w:rPr>
-            </w:r>
-            <w:r>
-              <w:rPr>
-                <w:b/>
-                <w:sz w:val="18"/>
-              </w:rPr>
-              <w:t>Required</w:t>
-            </w:r>
-          </w:p>
-        </w:tc>
-        <w:tc>
-          <w:tcPr>
-            <w:tcW w:type="dxa" w:w="2880"/>
-          </w:tcPr>
-          <w:p>
-            <w:r>
-              <w:rPr>
-                <w:b/>
-              </w:rPr>
-            </w:r>
-            <w:r>
-              <w:rPr>
-                <w:b/>
-                <w:sz w:val="18"/>
-              </w:rPr>
-              <w:t>Rule</w:t>
-            </w:r>
-          </w:p>
-        </w:tc>
-      </w:tr>
-      <w:tr>
-        <w:tc>
-          <w:tcPr>
-            <w:tcW w:type="dxa" w:w="2880"/>
-          </w:tcPr>
-          <w:p>
-            <w:r/>
-            <w:r>
-              <w:rPr>
-                <w:rFonts w:ascii="Consolas" w:hAnsi="Consolas"/>
-                <w:sz w:val="18"/>
-              </w:rPr>
-              <w:t>consent_obtained</w:t>
-            </w:r>
-          </w:p>
-        </w:tc>
-        <w:tc>
-          <w:tcPr>
-            <w:tcW w:type="dxa" w:w="2880"/>
-          </w:tcPr>
-          <w:p>
-            <w:r/>
-            <w:r>
-              <w:rPr>
-                <w:sz w:val="18"/>
-              </w:rPr>
-              <w:t>Yes</w:t>
-            </w:r>
-          </w:p>
-        </w:tc>
-        <w:tc>
-          <w:tcPr>
-            <w:tcW w:type="dxa" w:w="2880"/>
-          </w:tcPr>
-          <w:p>
-            <w:r/>
-            <w:r>
-              <w:rPr>
-                <w:rFonts w:ascii="Consolas" w:hAnsi="Consolas"/>
-                <w:sz w:val="18"/>
-              </w:rPr>
-              <w:t>true</w:t>
-            </w:r>
-            <w:r>
-              <w:rPr>
-                <w:sz w:val="18"/>
-              </w:rPr>
-              <w:t xml:space="preserve"> only if the patient agreed to be recorded and to their record being used.</w:t>
-            </w:r>
-          </w:p>
-        </w:tc>
-      </w:tr>
-      <w:tr>
-        <w:tc>
-          <w:tcPr>
-            <w:tcW w:type="dxa" w:w="2880"/>
-          </w:tcPr>
-          <w:p>
-            <w:r/>
-            <w:r>
-              <w:rPr>
-                <w:rFonts w:ascii="Consolas" w:hAnsi="Consolas"/>
-                <w:sz w:val="18"/>
-              </w:rPr>
-              <w:t>consent_method</w:t>
-            </w:r>
-          </w:p>
-        </w:tc>
-        <w:tc>
-          <w:tcPr>
-            <w:tcW w:type="dxa" w:w="2880"/>
-          </w:tcPr>
-          <w:p>
-            <w:r/>
-            <w:r>
-              <w:rPr>
-                <w:sz w:val="18"/>
-              </w:rPr>
-              <w:t>Yes</w:t>
-            </w:r>
-          </w:p>
-        </w:tc>
-        <w:tc>
-          <w:tcPr>
-            <w:tcW w:type="dxa" w:w="2880"/>
-          </w:tcPr>
-          <w:p>
-            <w:r/>
-            <w:r>
-              <w:rPr>
-                <w:sz w:val="18"/>
-              </w:rPr>
-              <w:t xml:space="preserve">How consent was taken, up to 64 characters — for example </w:t>
-            </w:r>
-            <w:r>
-              <w:rPr>
-                <w:rFonts w:ascii="Consolas" w:hAnsi="Consolas"/>
-                <w:sz w:val="18"/>
-              </w:rPr>
-              <w:t>verbal_at_reception</w:t>
-            </w:r>
-            <w:r>
-              <w:rPr>
-                <w:sz w:val="18"/>
-              </w:rPr>
-              <w:t xml:space="preserve"> or </w:t>
-            </w:r>
-            <w:r>
-              <w:rPr>
-                <w:rFonts w:ascii="Consolas" w:hAnsi="Consolas"/>
-                <w:sz w:val="18"/>
-              </w:rPr>
-              <w:t>signed_form</w:t>
-            </w:r>
-            <w:r>
-              <w:rPr>
-                <w:sz w:val="18"/>
-              </w:rPr>
-              <w:t>.</w:t>
-            </w:r>
-          </w:p>
-        </w:tc>
-      </w:tr>
-      <w:tr>
-        <w:tc>
-          <w:tcPr>
-            <w:tcW w:type="dxa" w:w="2880"/>
-          </w:tcPr>
-          <w:p>
-            <w:r/>
-            <w:r>
-              <w:rPr>
-                <w:rFonts w:ascii="Consolas" w:hAnsi="Consolas"/>
-                <w:sz w:val="18"/>
-              </w:rPr>
-              <w:t>consent_recorded_at</w:t>
-            </w:r>
-          </w:p>
-        </w:tc>
-        <w:tc>
-          <w:tcPr>
-            <w:tcW w:type="dxa" w:w="2880"/>
-          </w:tcPr>
-          <w:p>
-            <w:r/>
-            <w:r>
-              <w:rPr>
-                <w:sz w:val="18"/>
-              </w:rPr>
-              <w:t>Helpful</w:t>
-            </w:r>
-          </w:p>
-        </w:tc>
-        <w:tc>
-          <w:tcPr>
-            <w:tcW w:type="dxa" w:w="2880"/>
-          </w:tcPr>
-          <w:p>
-            <w:r/>
-            <w:r>
-              <w:rPr>
-                <w:sz w:val="18"/>
-              </w:rPr>
-              <w:t>When reception recorded it, with the time zone.</w:t>
-            </w:r>
-          </w:p>
-        </w:tc>
-      </w:tr>
-    </w:tbl>
-    <w:p/>
-    <w:p>
-      <w:r>
-        <w:t xml:space="preserve">If </w:t>
-      </w:r>
-      <w:r>
-        <w:rPr>
-          <w:rFonts w:ascii="Consolas" w:hAnsi="Consolas"/>
-          <w:sz w:val="20"/>
-        </w:rPr>
-        <w:t>consent_obtained</w:t>
-      </w:r>
-      <w:r>
-        <w:t xml:space="preserve"> is </w:t>
-      </w:r>
-      <w:r>
-        <w:rPr>
-          <w:rFonts w:ascii="Consolas" w:hAnsi="Consolas"/>
-          <w:sz w:val="20"/>
-        </w:rPr>
-        <w:t>false</w:t>
-      </w:r>
-      <w:r>
-        <w:t xml:space="preserve">, or missing, </w:t>
-      </w:r>
-      <w:r>
-        <w:rPr>
-          <w:b/>
-        </w:rPr>
-        <w:t>we keep nothing for that visit.</w:t>
-      </w:r>
-      <w:r>
-        <w:t xml:space="preserve"> The recorder stops, the audio it had already captured is deleted without being uploaded, and we store none of the patient's information or the prescription. The doctor's on-screen control says the consultation is not being recorded; the doctor carries on as normal. Our server replies </w:t>
-      </w:r>
-      <w:r>
-        <w:rPr>
-          <w:rFonts w:ascii="Consolas" w:hAnsi="Consolas"/>
-          <w:sz w:val="20"/>
-        </w:rPr>
-        <w:t>200 CONSENT_NOT_GIVEN</w:t>
-      </w:r>
-      <w:r>
-        <w:t>. There is nothing to retry.</w:t>
       </w:r>
     </w:p>
     <w:p>
@@ -1628,17 +1327,7 @@
         <w:t>start_time</w:t>
       </w:r>
       <w:r>
-        <w:t xml:space="preserve"> — not the time the prescription was issued. That is how the prescription attaches to the right consultation. If API 2 said the patient did not consent, we reply </w:t>
-      </w:r>
-      <w:r>
-        <w:rPr>
-          <w:rFonts w:ascii="Consolas" w:hAnsi="Consolas"/>
-          <w:sz w:val="20"/>
-        </w:rPr>
-        <w:t>200 CONSENT_NOT_GIVEN</w:t>
-      </w:r>
-      <w:r>
-        <w:t xml:space="preserve"> and keep nothing.</w:t>
+        <w:t xml:space="preserve"> — not the time the prescription was issued. That is how the prescription attaches to the right consultation.</w:t>
       </w:r>
     </w:p>
     <w:p>
@@ -2849,65 +2538,6 @@
               <w:rPr>
                 <w:sz w:val="18"/>
               </w:rPr>
-              <w:t>200</w:t>
-            </w:r>
-          </w:p>
-        </w:tc>
-        <w:tc>
-          <w:tcPr>
-            <w:tcW w:type="dxa" w:w="2160"/>
-          </w:tcPr>
-          <w:p>
-            <w:r/>
-            <w:r>
-              <w:rPr>
-                <w:rFonts w:ascii="Consolas" w:hAnsi="Consolas"/>
-                <w:sz w:val="18"/>
-              </w:rPr>
-              <w:t>CONSENT_NOT_GIVEN</w:t>
-            </w:r>
-          </w:p>
-        </w:tc>
-        <w:tc>
-          <w:tcPr>
-            <w:tcW w:type="dxa" w:w="2160"/>
-          </w:tcPr>
-          <w:p>
-            <w:r/>
-            <w:r>
-              <w:rPr>
-                <w:sz w:val="18"/>
-              </w:rPr>
-              <w:t>No consent: nothing kept for this visit</w:t>
-            </w:r>
-          </w:p>
-        </w:tc>
-        <w:tc>
-          <w:tcPr>
-            <w:tcW w:type="dxa" w:w="2160"/>
-          </w:tcPr>
-          <w:p>
-            <w:r/>
-            <w:r>
-              <w:rPr>
-                <w:sz w:val="18"/>
-              </w:rPr>
-              <w:t>Nothing. Do not retry.</w:t>
-            </w:r>
-          </w:p>
-        </w:tc>
-      </w:tr>
-      <w:tr>
-        <w:tc>
-          <w:tcPr>
-            <w:tcW w:type="dxa" w:w="2160"/>
-          </w:tcPr>
-          <w:p>
-            <w:r/>
-            <w:r>
-              <w:rPr>
-                <w:sz w:val="18"/>
-              </w:rPr>
               <w:t>400 · 401 · 413 · 422</w:t>
             </w:r>
           </w:p>
@@ -3184,7 +2814,7 @@
         <w:t>A registered PC still cannot record just because someone asks it to.</w:t>
       </w:r>
       <w:r>
-        <w:t xml:space="preserve"> Every consultation needs its own short-lived permission, which the recorder requests from our backend at the moment of the trigger. Our backend checks that the doctor exists and works at that clinic, that the clinic matches the machine's registration, and that your API 2 records the patient's consent. The permission it issues lasts sixty seconds and works once.</w:t>
+        <w:t xml:space="preserve"> Every consultation needs its own short-lived permission, which the recorder requests from our backend at the moment of the trigger. Our backend checks that the doctor exists and works at that clinic, and that the clinic matches the machine's registration. The permission it issues lasts sixty seconds and works once.</w:t>
       </w:r>
     </w:p>
     <w:p>
@@ -3387,36 +3017,6 @@
               <w:rPr>
                 <w:sz w:val="18"/>
               </w:rPr>
-              <w:t>API 2 says the patient did not consent</w:t>
-            </w:r>
-          </w:p>
-        </w:tc>
-        <w:tc>
-          <w:tcPr>
-            <w:tcW w:type="dxa" w:w="4320"/>
-          </w:tcPr>
-          <w:p>
-            <w:r/>
-            <w:r>
-              <w:rPr>
-                <w:sz w:val="18"/>
-              </w:rPr>
-              <w:t>Recording stops at once. Nothing already captured is uploaded, and nothing about the visit is kept.</w:t>
-            </w:r>
-          </w:p>
-        </w:tc>
-      </w:tr>
-      <w:tr>
-        <w:tc>
-          <w:tcPr>
-            <w:tcW w:type="dxa" w:w="4320"/>
-          </w:tcPr>
-          <w:p>
-            <w:r/>
-            <w:r>
-              <w:rPr>
-                <w:sz w:val="18"/>
-              </w:rPr>
               <w:t>API 2 is late</w:t>
             </w:r>
           </w:p>
@@ -3550,6 +3150,89 @@
       </w:r>
       <w:r>
         <w:t xml:space="preserve"> Nothing beyond what you already send: API 2 at the moment the patient is opened, with the same five fields as API 1. That timing is the whole requirement. If API 2 is sent late as a matter of routine, recordings will sit unconfirmed until it arrives.</w:t>
+      </w:r>
+    </w:p>
+    <w:p>
+      <w:pPr>
+        <w:pStyle w:val="Heading3"/>
+      </w:pPr>
+      <w:r>
+        <w:t>9b. When a patient does not want to be recorded</w:t>
+      </w:r>
+    </w:p>
+    <w:p>
+      <w:r>
+        <w:rPr>
+          <w:b/>
+        </w:rPr>
+        <w:t>CMED sends nothing about consent.</w:t>
+      </w:r>
+      <w:r>
+        <w:t xml:space="preserve"> Reception asks each patient before the consultation, as the clinic does today.</w:t>
+      </w:r>
+    </w:p>
+    <w:p>
+      <w:r>
+        <w:t xml:space="preserve">If a patient does not want to be recorded — before or during the consultation — the doctor presses the red </w:t>
+      </w:r>
+      <w:r>
+        <w:rPr>
+          <w:b/>
+        </w:rPr>
+        <w:t>Stop</w:t>
+      </w:r>
+      <w:r>
+        <w:t xml:space="preserve"> button on our on-screen control and chooses </w:t>
+      </w:r>
+      <w:r>
+        <w:rPr>
+          <w:b/>
+        </w:rPr>
+        <w:t>Patient did not consent</w:t>
+      </w:r>
+      <w:r>
+        <w:t>. The microphone stops the moment the button is pressed. That consultation's recording is then deleted from the PC and from our servers, and we keep none of the patient information or prescription you send for that visit.</w:t>
+      </w:r>
+    </w:p>
+    <w:p>
+      <w:r>
+        <w:rPr>
+          <w:b/>
+        </w:rPr>
+        <w:t>Nothing changes for you.</w:t>
+      </w:r>
+      <w:r>
+        <w:t xml:space="preserve"> Keep sending API 1, API 2 and API 3 as normal. Our server still replies </w:t>
+      </w:r>
+      <w:r>
+        <w:rPr>
+          <w:rFonts w:ascii="Consolas" w:hAnsi="Consolas"/>
+          <w:sz w:val="20"/>
+        </w:rPr>
+        <w:t>202 ACCEPTED</w:t>
+      </w:r>
+      <w:r>
+        <w:t xml:space="preserve"> and simply keeps nothing for that visit. The recorder may reply </w:t>
+      </w:r>
+      <w:r>
+        <w:rPr>
+          <w:rFonts w:ascii="Consolas" w:hAnsi="Consolas"/>
+          <w:sz w:val="20"/>
+        </w:rPr>
+        <w:t>409 NO_ACTIVE_SESSION</w:t>
+      </w:r>
+      <w:r>
+        <w:t xml:space="preserve"> to the arm signal; ignore it, as for any other </w:t>
+      </w:r>
+      <w:r>
+        <w:rPr>
+          <w:rFonts w:ascii="Consolas" w:hAnsi="Consolas"/>
+          <w:sz w:val="20"/>
+        </w:rPr>
+        <w:t>409</w:t>
+      </w:r>
+      <w:r>
+        <w:t>. The next patient is recorded as usual.</w:t>
       </w:r>
     </w:p>
     <w:p>
@@ -4070,7 +3753,7 @@
               <w:rPr>
                 <w:sz w:val="18"/>
               </w:rPr>
-              <w:t>, with the consent from reception, and the prescription when it is built, both with the same five fields as API 1</w:t>
+              <w:t>, and the prescription when it is built, both with the same five fields as API 1</w:t>
             </w:r>
           </w:p>
         </w:tc>

</xml_diff>